<commit_message>
fix: bug vercel deploy
</commit_message>
<xml_diff>
--- a/docs/OnTapB1_1Week_NgocDuy.docx
+++ b/docs/OnTapB1_1Week_NgocDuy.docx
@@ -22422,15 +22422,7 @@
           <w:i/>
           <w:iCs/>
         </w:rPr>
-        <w:t>→</w:t>
-      </w:r>
-      <w:r>
-        <w:rPr>
-          <w:rFonts w:ascii="Times New Roman" w:eastAsia="Times New Roman" w:hAnsi="Times New Roman" w:cs="Times New Roman"/>
-          <w:i/>
-          <w:iCs/>
-        </w:rPr>
-        <w:t xml:space="preserve"> The person who</w:t>
+        <w:t>→ The person who</w:t>
       </w:r>
       <w:r>
         <w:rPr>
@@ -22513,15 +22505,7 @@
           <w:i/>
           <w:iCs/>
         </w:rPr>
-        <w:t>→</w:t>
-      </w:r>
-      <w:r>
-        <w:rPr>
-          <w:rFonts w:ascii="Times New Roman" w:eastAsia="Times New Roman" w:hAnsi="Times New Roman" w:cs="Times New Roman"/>
-          <w:i/>
-          <w:iCs/>
-        </w:rPr>
-        <w:t xml:space="preserve"> Our dog is</w:t>
+        <w:t>→ Our dog is</w:t>
       </w:r>
       <w:r>
         <w:rPr>
@@ -22604,15 +22588,7 @@
           <w:i/>
           <w:iCs/>
         </w:rPr>
-        <w:t>→</w:t>
-      </w:r>
-      <w:r>
-        <w:rPr>
-          <w:rFonts w:ascii="Times New Roman" w:eastAsia="Times New Roman" w:hAnsi="Times New Roman" w:cs="Times New Roman"/>
-          <w:i/>
-          <w:iCs/>
-        </w:rPr>
-        <w:t xml:space="preserve"> Could I</w:t>
+        <w:t>→ Could I</w:t>
       </w:r>
       <w:r>
         <w:rPr>
@@ -22697,15 +22673,7 @@
           <w:i/>
           <w:iCs/>
         </w:rPr>
-        <w:t>→</w:t>
-      </w:r>
-      <w:r>
-        <w:rPr>
-          <w:rFonts w:ascii="Times New Roman" w:eastAsia="Times New Roman" w:hAnsi="Times New Roman" w:cs="Times New Roman"/>
-          <w:i/>
-          <w:iCs/>
-        </w:rPr>
-        <w:t xml:space="preserve"> Why don’t you</w:t>
+        <w:t>→ Why don’t you</w:t>
       </w:r>
       <w:r>
         <w:rPr>
@@ -22806,15 +22774,7 @@
           <w:i/>
           <w:iCs/>
         </w:rPr>
-        <w:t>→</w:t>
-      </w:r>
-      <w:r>
-        <w:rPr>
-          <w:rFonts w:ascii="Times New Roman" w:eastAsia="Times New Roman" w:hAnsi="Times New Roman" w:cs="Times New Roman"/>
-          <w:i/>
-          <w:iCs/>
-        </w:rPr>
-        <w:t xml:space="preserve"> We need to</w:t>
+        <w:t>→ We need to</w:t>
       </w:r>
       <w:r>
         <w:rPr>
@@ -22915,15 +22875,7 @@
           <w:i/>
           <w:iCs/>
         </w:rPr>
-        <w:t>→</w:t>
-      </w:r>
-      <w:r>
-        <w:rPr>
-          <w:rFonts w:ascii="Times New Roman" w:eastAsia="Times New Roman" w:hAnsi="Times New Roman" w:cs="Times New Roman"/>
-          <w:i/>
-          <w:iCs/>
-        </w:rPr>
-        <w:t xml:space="preserve"> I think you</w:t>
+        <w:t>→ I think you</w:t>
       </w:r>
       <w:r>
         <w:rPr>
@@ -23024,15 +22976,7 @@
           <w:i/>
           <w:iCs/>
         </w:rPr>
-        <w:t>→</w:t>
-      </w:r>
-      <w:r>
-        <w:rPr>
-          <w:rFonts w:ascii="Times New Roman" w:eastAsia="Times New Roman" w:hAnsi="Times New Roman" w:cs="Times New Roman"/>
-          <w:i/>
-          <w:iCs/>
-        </w:rPr>
-        <w:t xml:space="preserve"> You don’t</w:t>
+        <w:t>→ You don’t</w:t>
       </w:r>
       <w:r>
         <w:rPr>
@@ -23133,15 +23077,7 @@
           <w:i/>
           <w:iCs/>
         </w:rPr>
-        <w:t>→</w:t>
-      </w:r>
-      <w:r>
-        <w:rPr>
-          <w:rFonts w:ascii="Times New Roman" w:eastAsia="Times New Roman" w:hAnsi="Times New Roman" w:cs="Times New Roman"/>
-          <w:i/>
-          <w:iCs/>
-        </w:rPr>
-        <w:t xml:space="preserve"> I didn’t</w:t>
+        <w:t>→ I didn’t</w:t>
       </w:r>
       <w:r>
         <w:rPr>
@@ -23242,15 +23178,7 @@
           <w:i/>
           <w:iCs/>
         </w:rPr>
-        <w:t>→</w:t>
-      </w:r>
-      <w:r>
-        <w:rPr>
-          <w:rFonts w:ascii="Times New Roman" w:eastAsia="Times New Roman" w:hAnsi="Times New Roman" w:cs="Times New Roman"/>
-          <w:i/>
-          <w:iCs/>
-        </w:rPr>
-        <w:t xml:space="preserve"> The e-mail</w:t>
+        <w:t>→ The e-mail</w:t>
       </w:r>
       <w:r>
         <w:rPr>
@@ -23353,15 +23281,7 @@
           <w:i/>
           <w:iCs/>
         </w:rPr>
-        <w:t>→</w:t>
-      </w:r>
-      <w:r>
-        <w:rPr>
-          <w:rFonts w:ascii="Times New Roman" w:eastAsia="Times New Roman" w:hAnsi="Times New Roman" w:cs="Times New Roman"/>
-          <w:i/>
-          <w:iCs/>
-        </w:rPr>
-        <w:t xml:space="preserve"> There’s something</w:t>
+        <w:t>→ There’s something</w:t>
       </w:r>
       <w:r>
         <w:rPr>
@@ -23723,19 +23643,7 @@
         <w:rPr>
           <w:rFonts w:ascii="Times New Roman" w:hAnsi="Times New Roman" w:cs="Times New Roman"/>
         </w:rPr>
-        <w:t>soccer as a kid. Adults don’t have as much time to play – my dad works so he doesn’t get to play soccer very much. One bad thing about a kid is school</w:t>
-      </w:r>
-      <w:r>
-        <w:rPr>
-          <w:rFonts w:ascii="Times New Roman" w:hAnsi="Times New Roman" w:cs="Times New Roman"/>
-        </w:rPr>
-        <w:t>.</w:t>
-      </w:r>
-      <w:r>
-        <w:rPr>
-          <w:rFonts w:ascii="Times New Roman" w:hAnsi="Times New Roman" w:cs="Times New Roman"/>
-        </w:rPr>
-        <w:t xml:space="preserve"> I don’t really like going to school. I can’t stand doing </w:t>
+        <w:t xml:space="preserve">soccer as a kid. Adults don’t have as much time to play – my dad works so he doesn’t get to play soccer very much. One bad thing about a kid is school. I don’t really like going to school. I can’t stand doing </w:t>
       </w:r>
       <w:r>
         <w:rPr>
@@ -24207,19 +24115,7 @@
         <w:rPr>
           <w:rFonts w:ascii="Times New Roman" w:hAnsi="Times New Roman" w:cs="Times New Roman"/>
         </w:rPr>
-        <w:t>dishes. Sometimes I can’t watch TV when my Dad wants to watch a program that I can’t watch</w:t>
-      </w:r>
-      <w:r>
-        <w:rPr>
-          <w:rFonts w:ascii="Times New Roman" w:hAnsi="Times New Roman" w:cs="Times New Roman"/>
-        </w:rPr>
-        <w:t xml:space="preserve">. </w:t>
-      </w:r>
-      <w:r>
-        <w:rPr>
-          <w:rFonts w:ascii="Times New Roman" w:hAnsi="Times New Roman" w:cs="Times New Roman"/>
-        </w:rPr>
-        <w:t>I don't</w:t>
+        <w:t>dishes. Sometimes I can’t watch TV when my Dad wants to watch a program that I can’t watch. I don't</w:t>
       </w:r>
       <w:r>
         <w:rPr>
@@ -24858,7 +24754,39 @@
           <w:rFonts w:ascii="Times New Roman" w:hAnsi="Times New Roman" w:cs="Times New Roman"/>
           <w:spacing w:val="-7"/>
         </w:rPr>
-        <w:t>.</w:t>
+        <w:t xml:space="preserve">. </w:t>
+      </w:r>
+      <w:r>
+        <w:rPr>
+          <w:rFonts w:ascii="Times New Roman" w:hAnsi="Times New Roman" w:cs="Times New Roman"/>
+        </w:rPr>
+        <w:t>I</w:t>
+      </w:r>
+      <w:r>
+        <w:rPr>
+          <w:rFonts w:ascii="Times New Roman" w:hAnsi="Times New Roman" w:cs="Times New Roman"/>
+          <w:spacing w:val="-6"/>
+        </w:rPr>
+        <w:t xml:space="preserve"> </w:t>
+      </w:r>
+      <w:r>
+        <w:rPr>
+          <w:rFonts w:ascii="Times New Roman" w:hAnsi="Times New Roman" w:cs="Times New Roman"/>
+        </w:rPr>
+        <w:t>don't</w:t>
+      </w:r>
+      <w:r>
+        <w:rPr>
+          <w:rFonts w:ascii="Times New Roman" w:hAnsi="Times New Roman" w:cs="Times New Roman"/>
+          <w:spacing w:val="-6"/>
+        </w:rPr>
+        <w:t xml:space="preserve"> </w:t>
+      </w:r>
+      <w:r>
+        <w:rPr>
+          <w:rFonts w:ascii="Times New Roman" w:hAnsi="Times New Roman" w:cs="Times New Roman"/>
+        </w:rPr>
+        <w:t>like</w:t>
       </w:r>
       <w:r>
         <w:rPr>
@@ -24871,45 +24799,6 @@
         <w:rPr>
           <w:rFonts w:ascii="Times New Roman" w:hAnsi="Times New Roman" w:cs="Times New Roman"/>
         </w:rPr>
-        <w:t>I</w:t>
-      </w:r>
-      <w:r>
-        <w:rPr>
-          <w:rFonts w:ascii="Times New Roman" w:hAnsi="Times New Roman" w:cs="Times New Roman"/>
-          <w:spacing w:val="-6"/>
-        </w:rPr>
-        <w:t xml:space="preserve"> </w:t>
-      </w:r>
-      <w:r>
-        <w:rPr>
-          <w:rFonts w:ascii="Times New Roman" w:hAnsi="Times New Roman" w:cs="Times New Roman"/>
-        </w:rPr>
-        <w:t>don't</w:t>
-      </w:r>
-      <w:r>
-        <w:rPr>
-          <w:rFonts w:ascii="Times New Roman" w:hAnsi="Times New Roman" w:cs="Times New Roman"/>
-          <w:spacing w:val="-6"/>
-        </w:rPr>
-        <w:t xml:space="preserve"> </w:t>
-      </w:r>
-      <w:r>
-        <w:rPr>
-          <w:rFonts w:ascii="Times New Roman" w:hAnsi="Times New Roman" w:cs="Times New Roman"/>
-        </w:rPr>
-        <w:t>like</w:t>
-      </w:r>
-      <w:r>
-        <w:rPr>
-          <w:rFonts w:ascii="Times New Roman" w:hAnsi="Times New Roman" w:cs="Times New Roman"/>
-          <w:spacing w:val="-7"/>
-        </w:rPr>
-        <w:t xml:space="preserve"> </w:t>
-      </w:r>
-      <w:r>
-        <w:rPr>
-          <w:rFonts w:ascii="Times New Roman" w:hAnsi="Times New Roman" w:cs="Times New Roman"/>
-        </w:rPr>
         <w:t>older people telling me what to do. That’s probably the</w:t>
       </w:r>
       <w:r>
@@ -25049,14 +24938,7 @@
           <w:rFonts w:ascii="Times New Roman" w:hAnsi="Times New Roman" w:cs="Times New Roman"/>
           <w:spacing w:val="-2"/>
         </w:rPr>
-        <w:t>.</w:t>
-      </w:r>
-      <w:r>
-        <w:rPr>
-          <w:rFonts w:ascii="Times New Roman" w:hAnsi="Times New Roman" w:cs="Times New Roman"/>
-          <w:spacing w:val="-2"/>
-        </w:rPr>
-        <w:t xml:space="preserve"> </w:t>
+        <w:t xml:space="preserve">. </w:t>
       </w:r>
       <w:r>
         <w:rPr>
@@ -26419,16 +26301,7 @@
           <w:bCs/>
           <w:highlight w:val="yellow"/>
         </w:rPr>
-        <w:t xml:space="preserve">A. </w:t>
-      </w:r>
-      <w:r>
-        <w:rPr>
-          <w:rFonts w:ascii="Times New Roman" w:hAnsi="Times New Roman" w:cs="Times New Roman"/>
-          <w:b/>
-          <w:bCs/>
-          <w:highlight w:val="yellow"/>
-        </w:rPr>
-        <w:t>He</w:t>
+        <w:t>A. He</w:t>
       </w:r>
       <w:r>
         <w:rPr>
@@ -31582,6 +31455,8 @@
       <w:r>
         <w:rPr>
           <w:rFonts w:ascii="Times New Roman" w:hAnsi="Times New Roman" w:cs="Times New Roman"/>
+          <w:b/>
+          <w:bCs/>
           <w:spacing w:val="-4"/>
           <w:highlight w:val="yellow"/>
         </w:rPr>
@@ -31676,6 +31551,8 @@
       <w:r>
         <w:rPr>
           <w:rFonts w:ascii="Times New Roman" w:hAnsi="Times New Roman" w:cs="Times New Roman"/>
+          <w:b/>
+          <w:bCs/>
           <w:highlight w:val="yellow"/>
         </w:rPr>
         <w:t>B.</w:t>
@@ -31683,14 +31560,18 @@
       <w:r>
         <w:rPr>
           <w:rFonts w:ascii="Times New Roman" w:hAnsi="Times New Roman" w:cs="Times New Roman"/>
-          <w:spacing w:val="-2"/>
-          <w:highlight w:val="yellow"/>
-        </w:rPr>
-        <w:t xml:space="preserve"> </w:t>
-      </w:r>
-      <w:r>
-        <w:rPr>
-          <w:rFonts w:ascii="Times New Roman" w:hAnsi="Times New Roman" w:cs="Times New Roman"/>
+          <w:b/>
+          <w:bCs/>
+          <w:spacing w:val="-2"/>
+          <w:highlight w:val="yellow"/>
+        </w:rPr>
+        <w:t xml:space="preserve"> </w:t>
+      </w:r>
+      <w:r>
+        <w:rPr>
+          <w:rFonts w:ascii="Times New Roman" w:hAnsi="Times New Roman" w:cs="Times New Roman"/>
+          <w:b/>
+          <w:bCs/>
           <w:spacing w:val="-4"/>
           <w:highlight w:val="yellow"/>
         </w:rPr>
@@ -31759,6 +31640,8 @@
       <w:r>
         <w:rPr>
           <w:rFonts w:ascii="Times New Roman" w:hAnsi="Times New Roman" w:cs="Times New Roman"/>
+          <w:b/>
+          <w:bCs/>
           <w:highlight w:val="yellow"/>
         </w:rPr>
         <w:t>B.</w:t>
@@ -31766,14 +31649,18 @@
       <w:r>
         <w:rPr>
           <w:rFonts w:ascii="Times New Roman" w:hAnsi="Times New Roman" w:cs="Times New Roman"/>
-          <w:spacing w:val="-2"/>
-          <w:highlight w:val="yellow"/>
-        </w:rPr>
-        <w:t xml:space="preserve"> </w:t>
-      </w:r>
-      <w:r>
-        <w:rPr>
-          <w:rFonts w:ascii="Times New Roman" w:hAnsi="Times New Roman" w:cs="Times New Roman"/>
+          <w:b/>
+          <w:bCs/>
+          <w:spacing w:val="-2"/>
+          <w:highlight w:val="yellow"/>
+        </w:rPr>
+        <w:t xml:space="preserve"> </w:t>
+      </w:r>
+      <w:r>
+        <w:rPr>
+          <w:rFonts w:ascii="Times New Roman" w:hAnsi="Times New Roman" w:cs="Times New Roman"/>
+          <w:b/>
+          <w:bCs/>
           <w:spacing w:val="-4"/>
           <w:highlight w:val="yellow"/>
         </w:rPr>
@@ -31842,6 +31729,8 @@
       <w:r>
         <w:rPr>
           <w:rFonts w:ascii="Times New Roman" w:hAnsi="Times New Roman" w:cs="Times New Roman"/>
+          <w:b/>
+          <w:bCs/>
           <w:highlight w:val="yellow"/>
         </w:rPr>
         <w:t>B.</w:t>
@@ -31849,14 +31738,18 @@
       <w:r>
         <w:rPr>
           <w:rFonts w:ascii="Times New Roman" w:hAnsi="Times New Roman" w:cs="Times New Roman"/>
-          <w:spacing w:val="-2"/>
-          <w:highlight w:val="yellow"/>
-        </w:rPr>
-        <w:t xml:space="preserve"> </w:t>
-      </w:r>
-      <w:r>
-        <w:rPr>
-          <w:rFonts w:ascii="Times New Roman" w:hAnsi="Times New Roman" w:cs="Times New Roman"/>
+          <w:b/>
+          <w:bCs/>
+          <w:spacing w:val="-2"/>
+          <w:highlight w:val="yellow"/>
+        </w:rPr>
+        <w:t xml:space="preserve"> </w:t>
+      </w:r>
+      <w:r>
+        <w:rPr>
+          <w:rFonts w:ascii="Times New Roman" w:hAnsi="Times New Roman" w:cs="Times New Roman"/>
+          <w:b/>
+          <w:bCs/>
           <w:spacing w:val="-4"/>
           <w:highlight w:val="yellow"/>
         </w:rPr>
@@ -31924,6 +31817,8 @@
       <w:r>
         <w:rPr>
           <w:rFonts w:ascii="Times New Roman" w:hAnsi="Times New Roman" w:cs="Times New Roman"/>
+          <w:b/>
+          <w:bCs/>
           <w:highlight w:val="yellow"/>
         </w:rPr>
         <w:t>B.</w:t>
@@ -31931,14 +31826,18 @@
       <w:r>
         <w:rPr>
           <w:rFonts w:ascii="Times New Roman" w:hAnsi="Times New Roman" w:cs="Times New Roman"/>
-          <w:spacing w:val="-2"/>
-          <w:highlight w:val="yellow"/>
-        </w:rPr>
-        <w:t xml:space="preserve"> </w:t>
-      </w:r>
-      <w:r>
-        <w:rPr>
-          <w:rFonts w:ascii="Times New Roman" w:hAnsi="Times New Roman" w:cs="Times New Roman"/>
+          <w:b/>
+          <w:bCs/>
+          <w:spacing w:val="-2"/>
+          <w:highlight w:val="yellow"/>
+        </w:rPr>
+        <w:t xml:space="preserve"> </w:t>
+      </w:r>
+      <w:r>
+        <w:rPr>
+          <w:rFonts w:ascii="Times New Roman" w:hAnsi="Times New Roman" w:cs="Times New Roman"/>
+          <w:b/>
+          <w:bCs/>
           <w:spacing w:val="-4"/>
           <w:highlight w:val="yellow"/>
         </w:rPr>
@@ -34831,6 +34730,7 @@
   <w:style w:type="character" w:default="1" w:styleId="DefaultParagraphFont">
     <w:name w:val="Default Paragraph Font"/>
     <w:uiPriority w:val="1"/>
+    <w:semiHidden/>
     <w:unhideWhenUsed/>
   </w:style>
   <w:style w:type="table" w:default="1" w:styleId="TableNormal">

</xml_diff>